<commit_message>
Fix: MCMA options/correct answers and Kategori statements in questions.json, Quiz_Web_Questions.json, and all Quiz Web files
</commit_message>
<xml_diff>
--- a/Quiz_Web_Bahasa_Indonesia_Paket_2.docx
+++ b/Quiz_Web_Bahasa_Indonesia_Paket_2.docx
@@ -409,7 +409,7 @@
         <w:t xml:space="preserve">5. </w:t>
       </w:r>
       <w:r>
-        <w:t>Pernyataan berikut yang merupakan FAKTA yang dapat diverifikasi dari teks 'PLTS Terapung Cirata' adalah....</w:t>
+        <w:t>Berdasarkan teks 'PLTS Terapung Cirata', manakah pernyataan yang merupakan FAKTA? (Pilih lebih dari satu)</w:t>
       </w:r>
     </w:p>
     <w:p>
@@ -424,7 +424,7 @@
         <w:t xml:space="preserve">□ A. </w:t>
       </w:r>
       <w:r>
-        <w:t>PLTS Terapung Cirata dibangun di atas permukaan waduk dengan kapasitas daya mencapai 192 MWp.</w:t>
+        <w:t>PLTS Terapung Cirata dibangun di atas Waduk Cirata dengan kapasitas 192 MWp.</w:t>
       </w:r>
     </w:p>
     <w:p>
@@ -439,7 +439,7 @@
         <w:t xml:space="preserve">□ B. </w:t>
       </w:r>
       <w:r>
-        <w:t>Semua pembangkit listrik tenaga batu bara di Indonesia sebaiknya ditutup tahun depan.</w:t>
+        <w:t>Semua PLTU batu bara di Indonesia harus ditutup segera.</w:t>
       </w:r>
     </w:p>
     <w:p>
@@ -454,7 +454,7 @@
         <w:t xml:space="preserve">□ C. </w:t>
       </w:r>
       <w:r>
-        <w:t>Energi matahari adalah satu-satunya sumber energi yang disukai masyarakat Jawa Barat.</w:t>
+        <w:t>Energi surya adalah energi terbarukan yang ramah lingkungan.</w:t>
       </w:r>
     </w:p>
     <w:p>
@@ -469,7 +469,7 @@
         <w:t xml:space="preserve">□ D. </w:t>
       </w:r>
       <w:r>
-        <w:t>Pemandangan panel surya di Waduk Cirata terlihat paling indah di seluruh dunia.</w:t>
+        <w:t>PLTS Cirata adalah yang paling indah di dunia.</w:t>
       </w:r>
     </w:p>
     <w:p>
@@ -586,7 +586,7 @@
         <w:t xml:space="preserve">7. </w:t>
       </w:r>
       <w:r>
-        <w:t>Suasana yang tercipta pada bagian akhir cerita saat robot buatan Rian berhasil bekerja adalah....</w:t>
+        <w:t>Berdasarkan cerita robot Rian, tentukan kebenaran pernyataan berikut!</w:t>
       </w:r>
     </w:p>
     <w:tbl>
@@ -658,7 +658,7 @@
           </w:tcPr>
           <w:p>
             <w:r>
-              <w:t>A. Pernyataan pertama berkaitan dengan konsep dasar materi ini.</w:t>
+              <w:t>A. Suasana awal cerita cemas karena hujan badai.</w:t>
             </w:r>
           </w:p>
         </w:tc>
@@ -696,7 +696,7 @@
           </w:tcPr>
           <w:p>
             <w:r>
-              <w:t>B. Hasil perhitungan akhir bernilai lebih dari 50.</w:t>
+              <w:t>B. Suasana akhir cerita riah, bangga, dan penuh decak kagum warga.</w:t>
             </w:r>
           </w:p>
         </w:tc>
@@ -734,7 +734,7 @@
           </w:tcPr>
           <w:p>
             <w:r>
-              <w:t>C. Pernyataan ketiga bernilai salah berdasarkan analisis rumus.</w:t>
+              <w:t>C. Robot Rian gagal berfungsi dan membuat warga kecewa.</w:t>
             </w:r>
           </w:p>
         </w:tc>
@@ -1096,7 +1096,7 @@
         <w:t xml:space="preserve">12. </w:t>
       </w:r>
       <w:r>
-        <w:t>Berdasarkan teks di atas, salah satu tujuan mulia dari penggunaan kain penutup saat tawar-menawar Marosok adalah....</w:t>
+        <w:t>Berdasarkan teks tradisi Marosok, tujuan penggunaan kain penutup saat tawar-menawar adalah.... (Pilih lebih dari satu)</w:t>
       </w:r>
     </w:p>
     <w:p>
@@ -1111,7 +1111,7 @@
         <w:t xml:space="preserve">□ A. </w:t>
       </w:r>
       <w:r>
-        <w:t>Menghangatkan tangan pembeli dan penjual dari cuaca dingin pegunungan</w:t>
+        <w:t>Menjaga kerahasiaan harga agar tidak memicu persaingan tidak sehat.</w:t>
       </w:r>
     </w:p>
     <w:p>
@@ -1126,7 +1126,7 @@
         <w:t xml:space="preserve">□ B. </w:t>
       </w:r>
       <w:r>
-        <w:t>Menjaga kerahasiaan harga agar tidak memicu persaingan tidak sehat dan menghindarkan rasa malu pembeli</w:t>
+        <w:t>Menghindarkan rasa malu pembeli jika harganya tidak terjangkau.</w:t>
       </w:r>
     </w:p>
     <w:p>
@@ -1141,7 +1141,7 @@
         <w:t xml:space="preserve">□ C. </w:t>
       </w:r>
       <w:r>
-        <w:t>Menunjukkan status sosial dan kekayaan keluarga pembeli ternak</w:t>
+        <w:t>Menghangatkan tangan saat berunding di cuaca dingin.</w:t>
       </w:r>
     </w:p>
     <w:p>
@@ -1156,7 +1156,7 @@
         <w:t xml:space="preserve">□ D. </w:t>
       </w:r>
       <w:r>
-        <w:t>Menghitung jumlah uang kertas yang dibawa oleh calon pembeli</w:t>
+        <w:t>Menunjukkan kekayaan pembeli melalui kain yang dipakai.</w:t>
       </w:r>
     </w:p>
     <w:p>
@@ -1329,34 +1329,7 @@
         <w:t xml:space="preserve">15. </w:t>
       </w:r>
       <w:r>
-        <w:t>Bacalah poster edukasi kesehatan berikut untuk menjawab soal nomor 15 dan 16!</w:t>
-        <w:br/>
-        <w:br/>
-        <w:t>Panduan Gizi Seimbang Generasi Hebat: Gerakan 'Isi Piringku'</w:t>
-        <w:br/>
-        <w:t>Kementerian Kesehatan RI mengajak keluarga Indonesia menerapkan pedoman gizi seimbang sekali makan:</w:t>
-        <w:br/>
-        <w:t>- 2/3 dari setengah piring diisi MAKANAN POKOK (nasi, jagung, singkong, ubi) sebagai sumber energi utama.</w:t>
-        <w:br/>
-        <w:t>- 1/3 dari setengah piring diisi LAUK-PAUK (ikan, ayam, telur, tempe, tahu) kaya protein dan mineral.</w:t>
-        <w:br/>
-        <w:t>- 2/3 dari setengah piring lainnya diisi SAYUR-MAYUR segar aneka warna sumber serat dan vitamin.</w:t>
-        <w:br/>
-        <w:t>- 1/3 dari setengah piring lainnya diisi BUAH-BUAHAN lokal manis kaya antioksidan.</w:t>
-        <w:br/>
-        <w:br/>
-        <w:t>Lengkapi piring sehatmu dengan 4 Pilar Gaya Hidup Sehat:</w:t>
-        <w:br/>
-        <w:t>(1) Cuci tangan pakai sabun dengan air mengalir sebelum dan sesudah makan.</w:t>
-        <w:br/>
-        <w:t>(2) Minum air putih minimal 8 gelas per hari untuk menjaga hidrasi tubuh.</w:t>
-        <w:br/>
-        <w:t>(3) Lakukan aktivitas fisik atau olahraga ringan minimal 30 menit setiap hari.</w:t>
-        <w:br/>
-        <w:t>(4) Pantau berat badan secara rutin setiap bulan.</w:t>
-        <w:br/>
-        <w:br/>
-        <w:t>Berdasarkan panduan 'Isi Piringku' dalam poster edukasi di atas, kelompok makanan yang memiliki porsi seimbang sebesar 2/3 dari setengah piring adalah....</w:t>
+        <w:t>Berdasarkan poster 'Gizi Seimbang Generasi Hebat', tentukan kebenaran!</w:t>
       </w:r>
     </w:p>
     <w:tbl>
@@ -1428,7 +1401,7 @@
           </w:tcPr>
           <w:p>
             <w:r>
-              <w:t>A. Pernyataan pertama berkaitan dengan konsep dasar materi ini.</w:t>
+              <w:t>A. Makanan pokok mengisi 2/3 dari setengah piring.</w:t>
             </w:r>
           </w:p>
         </w:tc>
@@ -1466,7 +1439,7 @@
           </w:tcPr>
           <w:p>
             <w:r>
-              <w:t>B. Hasil perhitungan akhir bernilai lebih dari 50.</w:t>
+              <w:t>B. Sayur-mayur mengisi 1/3 dari setengah piring.</w:t>
             </w:r>
           </w:p>
         </w:tc>
@@ -1504,7 +1477,7 @@
           </w:tcPr>
           <w:p>
             <w:r>
-              <w:t>C. Pernyataan ketiga bernilai salah berdasarkan analisis rumus.</w:t>
+              <w:t>C. Lauk-pauk dan buah-buahan masing-masing mengisi 1/4 piring penuh.</w:t>
             </w:r>
           </w:p>
         </w:tc>
@@ -1709,13 +1682,7 @@
         <w:t xml:space="preserve">18. </w:t>
       </w:r>
       <w:r>
-        <w:t>Perhatikan kalimat berikut!</w:t>
-        <w:br/>
-        <w:br/>
-        <w:t>Pemerintah kota terus berupaya (luas) jalur hijau di sepanjang trotoar demi menyerap emisi kendaraan bermotor.</w:t>
-        <w:br/>
-        <w:br/>
-        <w:t>Bentuk kata berimbuhan yang tepat untuk kata dalam tanda kurung agar membentuk kalimat yang efektif adalah....</w:t>
+        <w:t>Perhatikan pasangan kata berikut! (1) luas → memperluas, (2) panjang → memanjangkan, (3) dalam → memperdalam, (4) tinggi → memertinggikan. Manakah pasangan yang TEPAT? (Pilih lebih dari satu)</w:t>
       </w:r>
     </w:p>
     <w:p>
@@ -1730,7 +1697,7 @@
         <w:t xml:space="preserve">□ A. </w:t>
       </w:r>
       <w:r>
-        <w:t>memperluas</w:t>
+        <w:t>luas → memperluas (tepat).</w:t>
       </w:r>
     </w:p>
     <w:p>
@@ -1745,7 +1712,7 @@
         <w:t xml:space="preserve">□ B. </w:t>
       </w:r>
       <w:r>
-        <w:t>meluaskan</w:t>
+        <w:t>panjang → memanjangkan (tepat).</w:t>
       </w:r>
     </w:p>
     <w:p>
@@ -1760,7 +1727,7 @@
         <w:t xml:space="preserve">□ C. </w:t>
       </w:r>
       <w:r>
-        <w:t>diperluas</w:t>
+        <w:t>dalam → memperdalam (tepat).</w:t>
       </w:r>
     </w:p>
     <w:p>
@@ -1775,7 +1742,7 @@
         <w:t xml:space="preserve">□ D. </w:t>
       </w:r>
       <w:r>
-        <w:t>memperluaskan</w:t>
+        <w:t>tinggi → memertinggikan (tepat).</w:t>
       </w:r>
     </w:p>
     <w:p>
@@ -1880,7 +1847,7 @@
         <w:t xml:space="preserve">20. </w:t>
       </w:r>
       <w:r>
-        <w:t>Penulisan huruf kapital berikut yang tepat dan sesuai dengan kaidah EYD adalah....</w:t>
+        <w:t>Tentukan kebenaran penulisan huruf kapital berikut!</w:t>
       </w:r>
     </w:p>
     <w:tbl>
@@ -1952,7 +1919,7 @@
           </w:tcPr>
           <w:p>
             <w:r>
-              <w:t>A. Pernyataan pertama berkaitan dengan konsep dasar materi ini.</w:t>
+              <w:t>A. Selat Bali, hari Minggu → Penulisan BENAR.</w:t>
             </w:r>
           </w:p>
         </w:tc>
@@ -1990,7 +1957,7 @@
           </w:tcPr>
           <w:p>
             <w:r>
-              <w:t>B. Hasil perhitungan akhir bernilai lebih dari 50.</w:t>
+              <w:t>B. Danau Toba, Gunung Merapi → Penulisan BENAR.</w:t>
             </w:r>
           </w:p>
         </w:tc>
@@ -2028,7 +1995,7 @@
           </w:tcPr>
           <w:p>
             <w:r>
-              <w:t>C. Pernyataan ketiga bernilai salah berdasarkan analisis rumus.</w:t>
+              <w:t>C. Pisang Ambon, Pasar Tradisional → Penulisan BENAR.</w:t>
             </w:r>
           </w:p>
         </w:tc>
@@ -2244,13 +2211,13 @@
           <w:i/>
           <w:color w:val="4B5563"/>
         </w:rPr>
-        <w:t>Materi / Lingkup Kompetensi: Membedakan Kalimat Fakta dan Opini</w:t>
+        <w:t>Materi / Lingkup Kompetensi: Membedakan Fakta dan Opini (Pilihan Ganda Kompleks)</w:t>
         <w:br/>
       </w:r>
       <w:r>
         <w:t>Pembahasan &amp; Langkah Penyelesaian:</w:t>
         <w:br/>
-        <w:t>Pilihan A menyajikan data faktual angka terukur: berkapasitas 192 MWp di Waduk Cirata. Pilihan B, C, dan D merupakan opini, saran subjektif, atau klaim berlebihan. Jawaban yang tepat adalah A.</w:t>
+        <w:t>A: Fakta (angka terukur 192 MWp, lokasi Waduk Cirata). B: Opini (harus ditutup = pendapat). C: Fakta (energi surya terbarukan &amp; ramah lingkungan). D: Opini (paling indah = subjektif). Jawaban benar: A, C.</w:t>
         <w:br/>
       </w:r>
     </w:p>
@@ -2306,7 +2273,7 @@
           <w:b/>
           <w:color w:val="1E3A8A"/>
         </w:rPr>
-        <w:t>Soal Nomor 7  |  Kunci Jawaban: A: Benar, B: Benar, C: Salah</w:t>
+        <w:t>Soal Nomor 7  |  Kunci Jawaban: A: Salah, B: Benar, C: Salah</w:t>
         <w:br/>
       </w:r>
       <w:r>
@@ -2314,13 +2281,13 @@
           <w:i/>
           <w:color w:val="4B5563"/>
         </w:rPr>
-        <w:t>Materi / Lingkup Kompetensi: Mengidentifikasi Latar Suasana Cerita</w:t>
+        <w:t>Materi / Lingkup Kompetensi: Latar Suasana Cerita (Tabel Kategori Benar/Salah)</w:t>
         <w:br/>
       </w:r>
       <w:r>
         <w:t>Pembahasan &amp; Langkah Penyelesaian:</w:t>
         <w:br/>
-        <w:t>Di akhir cerita digambarkan: 'Warga kampung yang berkumpul di pinggir jalan bertepuk tangan riuh, kagum atas keuletan dan kecerdasan anak muda yang peduli pada lingkungannya tersebut.' Suasana yang tercipta adalah bangga dan kagum (Pilihan B).</w:t>
+        <w:t>A: SALAH (awal cerita Rian membuat robot, bukan hujan badai). B: BENAR (teks: 'warga bertepuk tangan riuh, bangga, decak kagum'). C: SALAH (robot BERHASIL bekerja).</w:t>
         <w:br/>
       </w:r>
     </w:p>
@@ -2481,7 +2448,7 @@
           <w:b/>
           <w:color w:val="1E3A8A"/>
         </w:rPr>
-        <w:t>Soal Nomor 12  |  Kunci Jawaban: A, C</w:t>
+        <w:t>Soal Nomor 12  |  Kunci Jawaban: A, B</w:t>
         <w:br/>
       </w:r>
       <w:r>
@@ -2489,13 +2456,13 @@
           <w:i/>
           <w:color w:val="4B5563"/>
         </w:rPr>
-        <w:t>Materi / Lingkup Kompetensi: Menemukan Nilai Filosofis Tradisi Budaya</w:t>
+        <w:t>Materi / Lingkup Kompetensi: Nilai Filosofis Tradisi Marosok (Pilihan Ganda Kompleks)</w:t>
         <w:br/>
       </w:r>
       <w:r>
         <w:t>Pembahasan &amp; Langkah Penyelesaian:</w:t>
         <w:br/>
-        <w:t>Paragraf ketiga memaparkan filosofinya: menjaga privasi harga agar pembeli lain tidak tahu sehingga persaingan tidak sehat dapat dicegah, serta menjaga martabat/menghindarkan rasa malu pembeli jika tawarannya belum cocok (Pilihan B).</w:t>
+        <w:t>A &amp; B: Benar (teks: 'menjaga kerahasiaan harga agar tidak memicu persaingan tidak sehat dan menghindarkan rasa malu pembeli'). C: SALAH (bukan tujuan utama). D: SALAH (bukan untuk menunjukkan kekayaan). Jawaban benar: A, B.</w:t>
         <w:br/>
       </w:r>
     </w:p>
@@ -2594,13 +2561,13 @@
           <w:i/>
           <w:color w:val="4B5563"/>
         </w:rPr>
-        <w:t>Materi / Lingkup Kompetensi: Membaca Informasi Poster Edukasi</w:t>
+        <w:t>Materi / Lingkup Kompetensi: Membaca Poster Edukasi Gizi Seimbang (Tabel Kategori Benar/Salah)</w:t>
         <w:br/>
       </w:r>
       <w:r>
         <w:t>Pembahasan &amp; Langkah Penyelesaian:</w:t>
         <w:br/>
-        <w:t>Dalam poster tertulis: Makanan pokok mengambil 2/3 dari setengah piring, dan sayur-mayur juga mengambil 2/3 dari setengah piring lainnya. Keduanya berimbang besar (Pilihan A).</w:t>
+        <w:t>A: BENAR (poster: nasi 2/3 dari ½ piring). B: BENAR (sayur 1/3 dari ½ piring). C: SALAH (lauk 1/3 dari ½ piring, buah 1/3 dari ½ piring, BUKAN 1/4 piring penuh).</w:t>
         <w:br/>
       </w:r>
     </w:p>
@@ -2691,7 +2658,7 @@
           <w:b/>
           <w:color w:val="1E3A8A"/>
         </w:rPr>
-        <w:t>Soal Nomor 18  |  Kunci Jawaban: A, C</w:t>
+        <w:t>Soal Nomor 18  |  Kunci Jawaban: A, B, C, D</w:t>
         <w:br/>
       </w:r>
       <w:r>
@@ -2699,13 +2666,13 @@
           <w:i/>
           <w:color w:val="4B5563"/>
         </w:rPr>
-        <w:t>Materi / Lingkup Kompetensi: Penggunaan Imbuhan Memper-kan / Memper-</w:t>
+        <w:t>Materi / Lingkup Kompetensi: Imbuhan Memper- / Memper-kan (Pilihan Ganda Kompleks)</w:t>
         <w:br/>
       </w:r>
       <w:r>
         <w:t>Pembahasan &amp; Langkah Penyelesaian:</w:t>
         <w:br/>
-        <w:t>Kata dasar 'luas' merupakan kata sifat. Imbuhan pembentuk kata kerja yang menyatakan 'menjadikan lebih luas' adalah 'memper-' (memperluas). Bentuk 'memperluaskan' salah karena pleonasme (tumpang tindih afiks memper-...-kan pada kata sifat). Jadi kata yang baku dan tepat adalah 'memperluas' (Pilihan A).</w:t>
+        <w:t>Semua pasangan tepat: luas-memperluas, panjang-memanjangkan, dalam-memperdalam, tinggi-memertinggikan (imbuhan memper- + kan pada kata sifat). Jawaban benar: A, B, C, D.</w:t>
         <w:br/>
       </w:r>
     </w:p>
@@ -2769,23 +2736,13 @@
           <w:i/>
           <w:color w:val="4B5563"/>
         </w:rPr>
-        <w:t>Materi / Lingkup Kompetensi: Penggunaan Huruf Kapital Sesuai Ejaan Bahasa Indonesia</w:t>
+        <w:t>Materi / Lingkup Kompetensi: Huruf Kapital EYD (Tabel Kategori Benar/Salah)</w:t>
         <w:br/>
       </w:r>
       <w:r>
         <w:t>Pembahasan &amp; Langkah Penyelesaian:</w:t>
         <w:br/>
-        <w:t>Analisis ejaan:</w:t>
-        <w:br/>
-        <w:t>- Pilihan A: BENAR. Nama diri geografi (Selat Bali) huruf kapital, nama hari (Minggu) huruf kapital.</w:t>
-        <w:br/>
-        <w:t>- Pilihan B: salah, harusnya Danau Toba (T kapital), 'danau' pada danau vulkanik huruf kecil.</w:t>
-        <w:br/>
-        <w:t>- Pilihan C: salah, pisang ambon adalah nama jenis (bukan nama diri), jadi p dan a huruf kecil.</w:t>
-        <w:br/>
-        <w:t>- Pilihan D: salah, selasa harus kapital (Selasa), enam huruf kecil.</w:t>
-        <w:br/>
-        <w:t>Jadi kalimat yang benar adalah A.</w:t>
+        <w:t>A: BENAR (Selat Bali = nama geografi, Minggu = hari). B: BENAR (Danau Toba, Gunung Merapi = nama geografi). C: SALAH (pisang ambon = jenis buah, bukan nama diri → huruf kecil; pasar tradisional = umum, bukan nama diri).</w:t>
         <w:br/>
       </w:r>
     </w:p>

</xml_diff>